<commit_message>
docs(sprint-7): align pytest evidence count
</commit_message>
<xml_diff>
--- a/docs/sprints/sprint-7/Entrega Jesus Sprint 7.docx
+++ b/docs/sprints/sprint-7/Entrega Jesus Sprint 7.docx
@@ -1078,6 +1078,7 @@
               <w:rPr>
                 <w:sz w:val="16"/>
               </w:rPr>
+              <w:lastRenderedPageBreak/>
               <w:t>PBL-04-T3</w:t>
             </w:r>
           </w:p>
@@ -1095,14 +1096,7 @@
               <w:rPr>
                 <w:sz w:val="16"/>
               </w:rPr>
-              <w:t xml:space="preserve">Prueba de pantalla montada con cinco estados y botones </w:t>
-            </w:r>
-            <w:r>
-              <w:rPr>
-                <w:sz w:val="16"/>
-              </w:rPr>
-              <w:lastRenderedPageBreak/>
-              <w:t>ejecutar, actualizar y reintentar</w:t>
+              <w:t>Prueba de pantalla montada con cinco estados y botones ejecutar, actualizar y reintentar</w:t>
             </w:r>
           </w:p>
         </w:tc>
@@ -1119,15 +1113,7 @@
               <w:rPr>
                 <w:sz w:val="16"/>
               </w:rPr>
-              <w:lastRenderedPageBreak/>
-              <w:t xml:space="preserve">Automatizada en DOM; pendiente inspección visual </w:t>
-            </w:r>
-            <w:r>
-              <w:rPr>
-                <w:sz w:val="16"/>
-              </w:rPr>
-              <w:lastRenderedPageBreak/>
-              <w:t>manual de cada estado</w:t>
+              <w:t>Automatizada en DOM; pendiente inspección visual manual de cada estado</w:t>
             </w:r>
           </w:p>
         </w:tc>
@@ -1146,7 +1132,6 @@
               <w:rPr>
                 <w:sz w:val="16"/>
               </w:rPr>
-              <w:lastRenderedPageBreak/>
               <w:t>PBL-05-T1</w:t>
             </w:r>
           </w:p>
@@ -1619,7 +1604,7 @@
         <w:rPr>
           <w:b/>
         </w:rPr>
-        <w:t>87 aprobadas, 7 omitidas</w:t>
+        <w:t>86 aprobadas, 7 omitidas</w:t>
       </w:r>
       <w:r>
         <w:t>; Mongo simulado, sin datos reales.</w:t>
@@ -3791,7 +3776,7 @@
           <w:rFonts w:ascii="Consolas" w:hAnsi="Consolas"/>
           <w:sz w:val="17"/>
         </w:rPr>
-        <w:t>87 passed, 7 skipped</w:t>
+        <w:t>86 passed, 7 skipped</w:t>
       </w:r>
       <w:r>
         <w:t xml:space="preserve"> en la suite backend; </w:t>
@@ -3993,11 +3978,36 @@
     </w:p>
     <w:p>
       <w:r>
-        <w:t>En backend/api_hospital: python -m pytest -q tests. Resultado esperado de esta ejecución: 87 passed, 7 skipped.</w:t>
+        <w:t xml:space="preserve">En backend/api_hospital: python -m pytest -q tests. Resultado esperado de </w:t>
+      </w:r>
+      <w:proofErr w:type="spellStart"/>
+      <w:r>
+        <w:t>esta</w:t>
+      </w:r>
+      <w:proofErr w:type="spellEnd"/>
+      <w:r>
+        <w:t xml:space="preserve"> </w:t>
+      </w:r>
+      <w:proofErr w:type="spellStart"/>
+      <w:r>
+        <w:t>ejecución</w:t>
+      </w:r>
+      <w:proofErr w:type="spellEnd"/>
+      <w:r>
+        <w:t>: 8</w:t>
+      </w:r>
+      <w:r>
+        <w:t xml:space="preserve">6 </w:t>
+      </w:r>
+      <w:r>
+        <w:t>passed, 7 skipped.</w:t>
       </w:r>
     </w:p>
     <w:p>
       <w:r>
+        <w:rPr>
+          <w:noProof/>
+        </w:rPr>
         <w:drawing>
           <wp:inline distT="0" distB="0" distL="0" distR="0" wp14:anchorId="408C9520" wp14:editId="3C0477D5">
             <wp:extent cx="6346190" cy="2692400"/>
@@ -4058,7 +4068,23 @@
     </w:p>
     <w:p>
       <w:r>
-        <w:t xml:space="preserve">En frontend/clinica-web-react: npm test. Resultado observado de esta </w:t>
+        <w:t xml:space="preserve">En frontend/clinica-web-react: npm test. Resultado </w:t>
+      </w:r>
+      <w:proofErr w:type="spellStart"/>
+      <w:r>
+        <w:t>observado</w:t>
+      </w:r>
+      <w:proofErr w:type="spellEnd"/>
+      <w:r>
+        <w:t xml:space="preserve"> de </w:t>
+      </w:r>
+      <w:proofErr w:type="spellStart"/>
+      <w:r>
+        <w:t>esta</w:t>
+      </w:r>
+      <w:proofErr w:type="spellEnd"/>
+      <w:r>
+        <w:t xml:space="preserve"> </w:t>
       </w:r>
       <w:proofErr w:type="spellStart"/>
       <w:r>
@@ -4087,6 +4113,9 @@
     </w:p>
     <w:p>
       <w:r>
+        <w:rPr>
+          <w:noProof/>
+        </w:rPr>
         <w:drawing>
           <wp:inline distT="0" distB="0" distL="0" distR="0" wp14:anchorId="25439563" wp14:editId="56EB109E">
             <wp:extent cx="6346190" cy="4290695"/>
@@ -4143,7 +4172,23 @@
     </w:p>
     <w:p>
       <w:r>
-        <w:t xml:space="preserve">En backend/api_hospital: python scripts/sprint7_smoke_public.py. Las diez rutas </w:t>
+        <w:t xml:space="preserve">En backend/api_hospital: python scripts/sprint7_smoke_public.py. Las </w:t>
+      </w:r>
+      <w:proofErr w:type="spellStart"/>
+      <w:r>
+        <w:t>diez</w:t>
+      </w:r>
+      <w:proofErr w:type="spellEnd"/>
+      <w:r>
+        <w:t xml:space="preserve"> </w:t>
+      </w:r>
+      <w:proofErr w:type="spellStart"/>
+      <w:r>
+        <w:t>rutas</w:t>
+      </w:r>
+      <w:proofErr w:type="spellEnd"/>
+      <w:r>
+        <w:t xml:space="preserve"> </w:t>
       </w:r>
       <w:proofErr w:type="spellStart"/>
       <w:r>
@@ -4156,6 +4201,9 @@
     </w:p>
     <w:p>
       <w:r>
+        <w:rPr>
+          <w:noProof/>
+        </w:rPr>
         <w:drawing>
           <wp:inline distT="0" distB="0" distL="0" distR="0" wp14:anchorId="6C4BC390" wp14:editId="4B5178FC">
             <wp:extent cx="6346190" cy="1641475"/>

</xml_diff>